<commit_message>
Presentation page: full metrics scorecard, and a presenter's script
- New section 6 on the page: every evaluation metric (AUC, TPR@1%FPR with
  95% CIs, accuracy, precision, recall, F1, FPR) for every model on both
  tests, Brier scores, the deployed model's confusion matrix at its flag
  line and at 0.5, and the validation scores before the test. Every number
  is read from reports/tables/. The page now has ten sections.
- scripts/build_talk_script.py writes reports/talk_script.md: what to say
  in each section and where to scroll and click, with its numbers taken
  from the same tables, plus a question-to-section table.
- DEMO.md, README, the report, the skill report and the slides updated;
  the screenshots were retaken; tests check the scorecard against the tables.

Co-Authored-By: Claude Opus 5.5 <noreply@anthropic.com>
</commit_message>
<xml_diff>
--- a/reports/skill_report.docx
+++ b/reports/skill_report.docx
@@ -1463,7 +1463,7 @@
           <w:b w:val="0"/>
           <w:i w:val="0"/>
         </w:rPr>
-        <w:t>The interface is a single web page titled "Can a model spot malware without running it?" that reads top to bottom as the whole presentation, in nine numbered sections, with no tabs or side panels.</w:t>
+        <w:t>The interface is a single web page titled "Can a model spot malware without running it?" that reads top to bottom as the whole presentation, in ten numbered sections, with no tabs or side panels.</w:t>
       </w:r>
     </w:p>
     <w:p>
@@ -1496,7 +1496,7 @@
           <w:b w:val="0"/>
           <w:i w:val="0"/>
         </w:rPr>
-        <w:t xml:space="preserve"> The question, the data (with a timeline of the training and future weeks), the contenders, how they were compared, the results (a chart of every model with 95% confidence intervals), the winner and why, what was learned, and the limits. Every number is read from reports/tables/.</w:t>
+        <w:t xml:space="preserve"> The question, the data (with a timeline of the training and future weeks), the contenders, how they were compared, the results (a chart of every model with 95% confidence intervals), a full scorecard (AUC, accuracy, precision, recall, F1 and false-alarm rate for every model on both tests, the deployed model's confusion matrix, and the cross-validation scores), the winner and why, what was learned, and the limits. Every number is read from reports/tables/.</w:t>
       </w:r>
     </w:p>
     <w:p>

</xml_diff>